<commit_message>
Update bootstrap portfolio assignment
</commit_message>
<xml_diff>
--- a/Bootstrap-Portfolio-Assignment/Assignment_3_Report.docx
+++ b/Bootstrap-Portfolio-Assignment/Assignment_3_Report.docx
@@ -1560,10 +1560,7 @@
         </w:rPr>
       </w:pPr>
       <w:r>
-        <w:rPr>
-          <w:rFonts w:ascii="Times New Roman" w:hAnsi="Times New Roman" w:cs="Times New Roman"/>
-        </w:rPr>
-        <w:t>The following spaces are reserved for website screenshots. The student can insert screenshots manually after testing the website on desktop and mobile screens.</w:t>
+        <w:t>The following screenshots show the completed Bootstrap portfolio website across the required sections.</w:t>
       </w:r>
     </w:p>
     <w:tbl>
@@ -1592,41 +1589,58 @@
           <w:tcPr>
             <w:tcW w:w="10080" w:type="dxa"/>
             <w:shd w:val="clear" w:color="auto" w:fill="F8FAFC"/>
+            <w:vAlign w:val="center"/>
           </w:tcPr>
           <w:p>
             <w:pPr>
-              <w:spacing w:before="360" w:after="0"/>
               <w:jc w:val="center"/>
+            </w:pPr>
+            <w:r/>
+            <w:r>
               <w:rPr>
-                <w:rFonts w:ascii="Times New Roman" w:hAnsi="Times New Roman" w:cs="Times New Roman"/>
+                <w:b/>
+                <w:sz w:val="22"/>
               </w:rPr>
+              <w:t>Screenshot 1: Desktop Hero Section</w:t>
+            </w:r>
+          </w:p>
+          <w:p>
+            <w:pPr>
+              <w:jc w:val="center"/>
             </w:pPr>
             <w:r>
-              <w:rPr>
-                <w:rFonts w:ascii="Times New Roman" w:hAnsi="Times New Roman" w:cs="Times New Roman"/>
-                <w:b/>
-                <w:color w:val="174B69"/>
-                <w:sz w:val="22"/>
-              </w:rPr>
-              <w:t>Screenshot 1: Desktop Homepage / Hero Section</w:t>
-            </w:r>
-            <w:r>
-              <w:rPr>
-                <w:rFonts w:ascii="Times New Roman" w:hAnsi="Times New Roman" w:cs="Times New Roman"/>
-                <w:b/>
-                <w:color w:val="174B69"/>
-                <w:sz w:val="22"/>
-              </w:rPr>
-              <w:br/>
-            </w:r>
-            <w:r>
-              <w:rPr>
-                <w:rFonts w:ascii="Times New Roman" w:hAnsi="Times New Roman" w:cs="Times New Roman"/>
-                <w:i/>
-                <w:color w:val="64748B"/>
-                <w:sz w:val="20"/>
-              </w:rPr>
-              <w:t>Insert screenshot here</w:t>
+              <w:drawing>
+                <wp:inline xmlns:a="http://schemas.openxmlformats.org/drawingml/2006/main" xmlns:pic="http://schemas.openxmlformats.org/drawingml/2006/picture">
+                  <wp:extent cx="5577840" cy="3398996"/>
+                  <wp:docPr id="1" name="Picture 1"/>
+                  <wp:cNvGraphicFramePr>
+                    <a:graphicFrameLocks noChangeAspect="1"/>
+                  </wp:cNvGraphicFramePr>
+                  <a:graphic>
+                    <a:graphicData uri="http://schemas.openxmlformats.org/drawingml/2006/picture">
+                      <pic:pic>
+                        <pic:nvPicPr>
+                          <pic:cNvPr id="0" name="01_desktop_hero.png"/>
+                          <pic:cNvPicPr/>
+                        </pic:nvPicPr>
+                        <pic:blipFill>
+                          <a:blip r:embed="rId11"/>
+                          <a:stretch>
+                            <a:fillRect/>
+                          </a:stretch>
+                        </pic:blipFill>
+                        <pic:spPr>
+                          <a:xfrm>
+                            <a:off x="0" y="0"/>
+                            <a:ext cx="5577840" cy="3398996"/>
+                          </a:xfrm>
+                          <a:prstGeom prst="rect"/>
+                        </pic:spPr>
+                      </pic:pic>
+                    </a:graphicData>
+                  </a:graphic>
+                </wp:inline>
+              </w:drawing>
             </w:r>
           </w:p>
         </w:tc>
@@ -1666,41 +1680,58 @@
           <w:tcPr>
             <w:tcW w:w="10080" w:type="dxa"/>
             <w:shd w:val="clear" w:color="auto" w:fill="F8FAFC"/>
+            <w:vAlign w:val="center"/>
           </w:tcPr>
           <w:p>
             <w:pPr>
-              <w:spacing w:before="360" w:after="0"/>
               <w:jc w:val="center"/>
+            </w:pPr>
+            <w:r/>
+            <w:r>
               <w:rPr>
-                <w:rFonts w:ascii="Times New Roman" w:hAnsi="Times New Roman" w:cs="Times New Roman"/>
+                <w:b/>
+                <w:sz w:val="22"/>
               </w:rPr>
+              <w:t>Screenshot 2: About Section &amp; Sidebar</w:t>
+            </w:r>
+          </w:p>
+          <w:p>
+            <w:pPr>
+              <w:jc w:val="center"/>
             </w:pPr>
             <w:r>
-              <w:rPr>
-                <w:rFonts w:ascii="Times New Roman" w:hAnsi="Times New Roman" w:cs="Times New Roman"/>
-                <w:b/>
-                <w:color w:val="174B69"/>
-                <w:sz w:val="22"/>
-              </w:rPr>
-              <w:t>Screenshot 2: Mobile Navbar Open</w:t>
-            </w:r>
-            <w:r>
-              <w:rPr>
-                <w:rFonts w:ascii="Times New Roman" w:hAnsi="Times New Roman" w:cs="Times New Roman"/>
-                <w:b/>
-                <w:color w:val="174B69"/>
-                <w:sz w:val="22"/>
-              </w:rPr>
-              <w:br/>
-            </w:r>
-            <w:r>
-              <w:rPr>
-                <w:rFonts w:ascii="Times New Roman" w:hAnsi="Times New Roman" w:cs="Times New Roman"/>
-                <w:i/>
-                <w:color w:val="64748B"/>
-                <w:sz w:val="20"/>
-              </w:rPr>
-              <w:t>Insert screenshot here</w:t>
+              <w:drawing>
+                <wp:inline xmlns:a="http://schemas.openxmlformats.org/drawingml/2006/main" xmlns:pic="http://schemas.openxmlformats.org/drawingml/2006/picture">
+                  <wp:extent cx="5577840" cy="3913203"/>
+                  <wp:docPr id="2" name="Picture 2"/>
+                  <wp:cNvGraphicFramePr>
+                    <a:graphicFrameLocks noChangeAspect="1"/>
+                  </wp:cNvGraphicFramePr>
+                  <a:graphic>
+                    <a:graphicData uri="http://schemas.openxmlformats.org/drawingml/2006/picture">
+                      <pic:pic>
+                        <pic:nvPicPr>
+                          <pic:cNvPr id="0" name="02_about_sidebar.png"/>
+                          <pic:cNvPicPr/>
+                        </pic:nvPicPr>
+                        <pic:blipFill>
+                          <a:blip r:embed="rId12"/>
+                          <a:stretch>
+                            <a:fillRect/>
+                          </a:stretch>
+                        </pic:blipFill>
+                        <pic:spPr>
+                          <a:xfrm>
+                            <a:off x="0" y="0"/>
+                            <a:ext cx="5577840" cy="3913203"/>
+                          </a:xfrm>
+                          <a:prstGeom prst="rect"/>
+                        </pic:spPr>
+                      </pic:pic>
+                    </a:graphicData>
+                  </a:graphic>
+                </wp:inline>
+              </w:drawing>
             </w:r>
           </w:p>
         </w:tc>
@@ -1740,41 +1771,58 @@
           <w:tcPr>
             <w:tcW w:w="10080" w:type="dxa"/>
             <w:shd w:val="clear" w:color="auto" w:fill="F8FAFC"/>
+            <w:vAlign w:val="center"/>
           </w:tcPr>
           <w:p>
             <w:pPr>
-              <w:spacing w:before="360" w:after="0"/>
               <w:jc w:val="center"/>
+            </w:pPr>
+            <w:r/>
+            <w:r>
               <w:rPr>
-                <w:rFonts w:ascii="Times New Roman" w:hAnsi="Times New Roman" w:cs="Times New Roman"/>
+                <w:b/>
+                <w:sz w:val="22"/>
               </w:rPr>
+              <w:t>Screenshot 3: Technical Skills</w:t>
+            </w:r>
+          </w:p>
+          <w:p>
+            <w:pPr>
+              <w:jc w:val="center"/>
             </w:pPr>
             <w:r>
-              <w:rPr>
-                <w:rFonts w:ascii="Times New Roman" w:hAnsi="Times New Roman" w:cs="Times New Roman"/>
-                <w:b/>
-                <w:color w:val="174B69"/>
-                <w:sz w:val="22"/>
-              </w:rPr>
-              <w:t>Screenshot 3: About Section with Sidebar</w:t>
-            </w:r>
-            <w:r>
-              <w:rPr>
-                <w:rFonts w:ascii="Times New Roman" w:hAnsi="Times New Roman" w:cs="Times New Roman"/>
-                <w:b/>
-                <w:color w:val="174B69"/>
-                <w:sz w:val="22"/>
-              </w:rPr>
-              <w:br/>
-            </w:r>
-            <w:r>
-              <w:rPr>
-                <w:rFonts w:ascii="Times New Roman" w:hAnsi="Times New Roman" w:cs="Times New Roman"/>
-                <w:i/>
-                <w:color w:val="64748B"/>
-                <w:sz w:val="20"/>
-              </w:rPr>
-              <w:t>Insert screenshot here</w:t>
+              <w:drawing>
+                <wp:inline xmlns:a="http://schemas.openxmlformats.org/drawingml/2006/main" xmlns:pic="http://schemas.openxmlformats.org/drawingml/2006/picture">
+                  <wp:extent cx="5577840" cy="3995999"/>
+                  <wp:docPr id="3" name="Picture 3"/>
+                  <wp:cNvGraphicFramePr>
+                    <a:graphicFrameLocks noChangeAspect="1"/>
+                  </wp:cNvGraphicFramePr>
+                  <a:graphic>
+                    <a:graphicData uri="http://schemas.openxmlformats.org/drawingml/2006/picture">
+                      <pic:pic>
+                        <pic:nvPicPr>
+                          <pic:cNvPr id="0" name="03_technical_skills.png"/>
+                          <pic:cNvPicPr/>
+                        </pic:nvPicPr>
+                        <pic:blipFill>
+                          <a:blip r:embed="rId13"/>
+                          <a:stretch>
+                            <a:fillRect/>
+                          </a:stretch>
+                        </pic:blipFill>
+                        <pic:spPr>
+                          <a:xfrm>
+                            <a:off x="0" y="0"/>
+                            <a:ext cx="5577840" cy="3995999"/>
+                          </a:xfrm>
+                          <a:prstGeom prst="rect"/>
+                        </pic:spPr>
+                      </pic:pic>
+                    </a:graphicData>
+                  </a:graphic>
+                </wp:inline>
+              </w:drawing>
             </w:r>
           </w:p>
         </w:tc>
@@ -1814,41 +1862,58 @@
           <w:tcPr>
             <w:tcW w:w="10080" w:type="dxa"/>
             <w:shd w:val="clear" w:color="auto" w:fill="F8FAFC"/>
+            <w:vAlign w:val="center"/>
           </w:tcPr>
           <w:p>
             <w:pPr>
-              <w:spacing w:before="360" w:after="0"/>
               <w:jc w:val="center"/>
+            </w:pPr>
+            <w:r/>
+            <w:r>
               <w:rPr>
-                <w:rFonts w:ascii="Times New Roman" w:hAnsi="Times New Roman" w:cs="Times New Roman"/>
+                <w:b/>
+                <w:sz w:val="22"/>
               </w:rPr>
+              <w:t>Screenshot 4: Project Cards</w:t>
+            </w:r>
+          </w:p>
+          <w:p>
+            <w:pPr>
+              <w:jc w:val="center"/>
             </w:pPr>
             <w:r>
-              <w:rPr>
-                <w:rFonts w:ascii="Times New Roman" w:hAnsi="Times New Roman" w:cs="Times New Roman"/>
-                <w:b/>
-                <w:color w:val="174B69"/>
-                <w:sz w:val="22"/>
-              </w:rPr>
-              <w:t>Screenshot 4: Projects / Services Cards</w:t>
-            </w:r>
-            <w:r>
-              <w:rPr>
-                <w:rFonts w:ascii="Times New Roman" w:hAnsi="Times New Roman" w:cs="Times New Roman"/>
-                <w:b/>
-                <w:color w:val="174B69"/>
-                <w:sz w:val="22"/>
-              </w:rPr>
-              <w:br/>
-            </w:r>
-            <w:r>
-              <w:rPr>
-                <w:rFonts w:ascii="Times New Roman" w:hAnsi="Times New Roman" w:cs="Times New Roman"/>
-                <w:i/>
-                <w:color w:val="64748B"/>
-                <w:sz w:val="20"/>
-              </w:rPr>
-              <w:t>Insert screenshot here</w:t>
+              <w:drawing>
+                <wp:inline xmlns:a="http://schemas.openxmlformats.org/drawingml/2006/main" xmlns:pic="http://schemas.openxmlformats.org/drawingml/2006/picture">
+                  <wp:extent cx="5577840" cy="5455825"/>
+                  <wp:docPr id="4" name="Picture 4"/>
+                  <wp:cNvGraphicFramePr>
+                    <a:graphicFrameLocks noChangeAspect="1"/>
+                  </wp:cNvGraphicFramePr>
+                  <a:graphic>
+                    <a:graphicData uri="http://schemas.openxmlformats.org/drawingml/2006/picture">
+                      <pic:pic>
+                        <pic:nvPicPr>
+                          <pic:cNvPr id="0" name="04_project_cards.png"/>
+                          <pic:cNvPicPr/>
+                        </pic:nvPicPr>
+                        <pic:blipFill>
+                          <a:blip r:embed="rId14"/>
+                          <a:stretch>
+                            <a:fillRect/>
+                          </a:stretch>
+                        </pic:blipFill>
+                        <pic:spPr>
+                          <a:xfrm>
+                            <a:off x="0" y="0"/>
+                            <a:ext cx="5577840" cy="5455825"/>
+                          </a:xfrm>
+                          <a:prstGeom prst="rect"/>
+                        </pic:spPr>
+                      </pic:pic>
+                    </a:graphicData>
+                  </a:graphic>
+                </wp:inline>
+              </w:drawing>
             </w:r>
           </w:p>
         </w:tc>
@@ -1901,42 +1966,58 @@
           <w:tcPr>
             <w:tcW w:w="10080" w:type="dxa"/>
             <w:shd w:val="clear" w:color="auto" w:fill="F8FAFC"/>
+            <w:vAlign w:val="center"/>
           </w:tcPr>
           <w:p>
             <w:pPr>
-              <w:spacing w:before="360" w:after="0"/>
               <w:jc w:val="center"/>
+            </w:pPr>
+            <w:r/>
+            <w:r>
               <w:rPr>
-                <w:rFonts w:ascii="Times New Roman" w:hAnsi="Times New Roman" w:cs="Times New Roman"/>
+                <w:b/>
+                <w:sz w:val="22"/>
               </w:rPr>
+              <w:t>Screenshot 5: Services Cards</w:t>
+            </w:r>
+          </w:p>
+          <w:p>
+            <w:pPr>
+              <w:jc w:val="center"/>
             </w:pPr>
             <w:r>
-              <w:rPr>
-                <w:rFonts w:ascii="Times New Roman" w:hAnsi="Times New Roman" w:cs="Times New Roman"/>
-                <w:b/>
-                <w:color w:val="174B69"/>
-                <w:sz w:val="22"/>
-              </w:rPr>
-              <w:lastRenderedPageBreak/>
-              <w:t>Screenshot 5: Bootstrap Utilities Showcase</w:t>
-            </w:r>
-            <w:r>
-              <w:rPr>
-                <w:rFonts w:ascii="Times New Roman" w:hAnsi="Times New Roman" w:cs="Times New Roman"/>
-                <w:b/>
-                <w:color w:val="174B69"/>
-                <w:sz w:val="22"/>
-              </w:rPr>
-              <w:br/>
-            </w:r>
-            <w:r>
-              <w:rPr>
-                <w:rFonts w:ascii="Times New Roman" w:hAnsi="Times New Roman" w:cs="Times New Roman"/>
-                <w:i/>
-                <w:color w:val="64748B"/>
-                <w:sz w:val="20"/>
-              </w:rPr>
-              <w:t>Insert screenshot here</w:t>
+              <w:drawing>
+                <wp:inline xmlns:a="http://schemas.openxmlformats.org/drawingml/2006/main" xmlns:pic="http://schemas.openxmlformats.org/drawingml/2006/picture">
+                  <wp:extent cx="5577840" cy="5464540"/>
+                  <wp:docPr id="5" name="Picture 5"/>
+                  <wp:cNvGraphicFramePr>
+                    <a:graphicFrameLocks noChangeAspect="1"/>
+                  </wp:cNvGraphicFramePr>
+                  <a:graphic>
+                    <a:graphicData uri="http://schemas.openxmlformats.org/drawingml/2006/picture">
+                      <pic:pic>
+                        <pic:nvPicPr>
+                          <pic:cNvPr id="0" name="05_services_cards.png"/>
+                          <pic:cNvPicPr/>
+                        </pic:nvPicPr>
+                        <pic:blipFill>
+                          <a:blip r:embed="rId15"/>
+                          <a:stretch>
+                            <a:fillRect/>
+                          </a:stretch>
+                        </pic:blipFill>
+                        <pic:spPr>
+                          <a:xfrm>
+                            <a:off x="0" y="0"/>
+                            <a:ext cx="5577840" cy="5464540"/>
+                          </a:xfrm>
+                          <a:prstGeom prst="rect"/>
+                        </pic:spPr>
+                      </pic:pic>
+                    </a:graphicData>
+                  </a:graphic>
+                </wp:inline>
+              </w:drawing>
             </w:r>
           </w:p>
         </w:tc>
@@ -1976,41 +2057,58 @@
           <w:tcPr>
             <w:tcW w:w="10080" w:type="dxa"/>
             <w:shd w:val="clear" w:color="auto" w:fill="F8FAFC"/>
+            <w:vAlign w:val="center"/>
           </w:tcPr>
           <w:p>
             <w:pPr>
-              <w:spacing w:before="360" w:after="0"/>
               <w:jc w:val="center"/>
+            </w:pPr>
+            <w:r/>
+            <w:r>
               <w:rPr>
-                <w:rFonts w:ascii="Times New Roman" w:hAnsi="Times New Roman" w:cs="Times New Roman"/>
+                <w:b/>
+                <w:sz w:val="22"/>
               </w:rPr>
+              <w:t>Screenshot 6: Bootstrap Utilities Showcase</w:t>
+            </w:r>
+          </w:p>
+          <w:p>
+            <w:pPr>
+              <w:jc w:val="center"/>
             </w:pPr>
             <w:r>
-              <w:rPr>
-                <w:rFonts w:ascii="Times New Roman" w:hAnsi="Times New Roman" w:cs="Times New Roman"/>
-                <w:b/>
-                <w:color w:val="174B69"/>
-                <w:sz w:val="22"/>
-              </w:rPr>
-              <w:t>Screenshot 6: Contact Form Validation</w:t>
-            </w:r>
-            <w:r>
-              <w:rPr>
-                <w:rFonts w:ascii="Times New Roman" w:hAnsi="Times New Roman" w:cs="Times New Roman"/>
-                <w:b/>
-                <w:color w:val="174B69"/>
-                <w:sz w:val="22"/>
-              </w:rPr>
-              <w:br/>
-            </w:r>
-            <w:r>
-              <w:rPr>
-                <w:rFonts w:ascii="Times New Roman" w:hAnsi="Times New Roman" w:cs="Times New Roman"/>
-                <w:i/>
-                <w:color w:val="64748B"/>
-                <w:sz w:val="20"/>
-              </w:rPr>
-              <w:t>Insert screenshot here</w:t>
+              <w:drawing>
+                <wp:inline xmlns:a="http://schemas.openxmlformats.org/drawingml/2006/main" xmlns:pic="http://schemas.openxmlformats.org/drawingml/2006/picture">
+                  <wp:extent cx="5577840" cy="5412248"/>
+                  <wp:docPr id="6" name="Picture 6"/>
+                  <wp:cNvGraphicFramePr>
+                    <a:graphicFrameLocks noChangeAspect="1"/>
+                  </wp:cNvGraphicFramePr>
+                  <a:graphic>
+                    <a:graphicData uri="http://schemas.openxmlformats.org/drawingml/2006/picture">
+                      <pic:pic>
+                        <pic:nvPicPr>
+                          <pic:cNvPr id="0" name="06_utilities_showcase.png"/>
+                          <pic:cNvPicPr/>
+                        </pic:nvPicPr>
+                        <pic:blipFill>
+                          <a:blip r:embed="rId16"/>
+                          <a:stretch>
+                            <a:fillRect/>
+                          </a:stretch>
+                        </pic:blipFill>
+                        <pic:spPr>
+                          <a:xfrm>
+                            <a:off x="0" y="0"/>
+                            <a:ext cx="5577840" cy="5412248"/>
+                          </a:xfrm>
+                          <a:prstGeom prst="rect"/>
+                        </pic:spPr>
+                      </pic:pic>
+                    </a:graphicData>
+                  </a:graphic>
+                </wp:inline>
+              </w:drawing>
             </w:r>
           </w:p>
         </w:tc>
@@ -2050,41 +2148,128 @@
           <w:tcPr>
             <w:tcW w:w="10080" w:type="dxa"/>
             <w:shd w:val="clear" w:color="auto" w:fill="F8FAFC"/>
+            <w:vAlign w:val="center"/>
           </w:tcPr>
           <w:p>
             <w:pPr>
-              <w:spacing w:before="360" w:after="0"/>
               <w:jc w:val="center"/>
+            </w:pPr>
+            <w:r/>
+            <w:r>
               <w:rPr>
-                <w:rFonts w:ascii="Times New Roman" w:hAnsi="Times New Roman" w:cs="Times New Roman"/>
+                <w:b/>
+                <w:sz w:val="22"/>
               </w:rPr>
+              <w:t>Screenshot 7: Contact Form Validation</w:t>
+            </w:r>
+          </w:p>
+          <w:p>
+            <w:pPr>
+              <w:jc w:val="center"/>
             </w:pPr>
             <w:r>
+              <w:drawing>
+                <wp:inline xmlns:a="http://schemas.openxmlformats.org/drawingml/2006/main" xmlns:pic="http://schemas.openxmlformats.org/drawingml/2006/picture">
+                  <wp:extent cx="5577840" cy="4240030"/>
+                  <wp:docPr id="7" name="Picture 7"/>
+                  <wp:cNvGraphicFramePr>
+                    <a:graphicFrameLocks noChangeAspect="1"/>
+                  </wp:cNvGraphicFramePr>
+                  <a:graphic>
+                    <a:graphicData uri="http://schemas.openxmlformats.org/drawingml/2006/picture">
+                      <pic:pic>
+                        <pic:nvPicPr>
+                          <pic:cNvPr id="0" name="07_contact_validation.png"/>
+                          <pic:cNvPicPr/>
+                        </pic:nvPicPr>
+                        <pic:blipFill>
+                          <a:blip r:embed="rId17"/>
+                          <a:stretch>
+                            <a:fillRect/>
+                          </a:stretch>
+                        </pic:blipFill>
+                        <pic:spPr>
+                          <a:xfrm>
+                            <a:off x="0" y="0"/>
+                            <a:ext cx="5577840" cy="4240030"/>
+                          </a:xfrm>
+                          <a:prstGeom prst="rect"/>
+                        </pic:spPr>
+                      </pic:pic>
+                    </a:graphicData>
+                  </a:graphic>
+                </wp:inline>
+              </w:drawing>
+            </w:r>
+          </w:p>
+        </w:tc>
+      </w:tr>
+    </w:tbl>
+    <w:tbl>
+      <w:tblPr>
+        <w:tblW w:type="auto" w:w="0"/>
+        <w:jc w:val="center"/>
+        <w:tblLook w:firstColumn="1" w:firstRow="1" w:lastColumn="0" w:lastRow="0" w:noHBand="0" w:noVBand="1" w:val="04A0"/>
+      </w:tblPr>
+      <w:tblGrid>
+        <w:gridCol w:w="10080"/>
+      </w:tblGrid>
+      <w:tr>
+        <w:tc>
+          <w:tcPr>
+            <w:tcW w:type="dxa" w:w="10080"/>
+            <w:vAlign w:val="center"/>
+          </w:tcPr>
+          <w:p>
+            <w:pPr>
+              <w:jc w:val="center"/>
+            </w:pPr>
+            <w:r/>
+            <w:r>
               <w:rPr>
-                <w:rFonts w:ascii="Times New Roman" w:hAnsi="Times New Roman" w:cs="Times New Roman"/>
                 <w:b/>
-                <w:color w:val="174B69"/>
                 <w:sz w:val="22"/>
               </w:rPr>
-              <w:t>Screenshot 7: Footer Section</w:t>
+              <w:t>Screenshot 8: Footer Details</w:t>
             </w:r>
+          </w:p>
+          <w:p>
+            <w:pPr>
+              <w:jc w:val="center"/>
+            </w:pPr>
             <w:r>
-              <w:rPr>
-                <w:rFonts w:ascii="Times New Roman" w:hAnsi="Times New Roman" w:cs="Times New Roman"/>
-                <w:b/>
-                <w:color w:val="174B69"/>
-                <w:sz w:val="22"/>
-              </w:rPr>
-              <w:br/>
-            </w:r>
-            <w:r>
-              <w:rPr>
-                <w:rFonts w:ascii="Times New Roman" w:hAnsi="Times New Roman" w:cs="Times New Roman"/>
-                <w:i/>
-                <w:color w:val="64748B"/>
-                <w:sz w:val="20"/>
-              </w:rPr>
-              <w:t>Insert screenshot here</w:t>
+              <w:drawing>
+                <wp:inline xmlns:a="http://schemas.openxmlformats.org/drawingml/2006/main" xmlns:pic="http://schemas.openxmlformats.org/drawingml/2006/picture">
+                  <wp:extent cx="5577840" cy="1533906"/>
+                  <wp:docPr id="8" name="Picture 8"/>
+                  <wp:cNvGraphicFramePr>
+                    <a:graphicFrameLocks noChangeAspect="1"/>
+                  </wp:cNvGraphicFramePr>
+                  <a:graphic>
+                    <a:graphicData uri="http://schemas.openxmlformats.org/drawingml/2006/picture">
+                      <pic:pic>
+                        <pic:nvPicPr>
+                          <pic:cNvPr id="0" name="08_footer_details.png"/>
+                          <pic:cNvPicPr/>
+                        </pic:nvPicPr>
+                        <pic:blipFill>
+                          <a:blip r:embed="rId18"/>
+                          <a:stretch>
+                            <a:fillRect/>
+                          </a:stretch>
+                        </pic:blipFill>
+                        <pic:spPr>
+                          <a:xfrm>
+                            <a:off x="0" y="0"/>
+                            <a:ext cx="5577840" cy="1533906"/>
+                          </a:xfrm>
+                          <a:prstGeom prst="rect"/>
+                        </pic:spPr>
+                      </pic:pic>
+                    </a:graphicData>
+                  </a:graphic>
+                </wp:inline>
+              </w:drawing>
             </w:r>
           </w:p>
         </w:tc>

</xml_diff>

<commit_message>
Update the report of Assignment#03
</commit_message>
<xml_diff>
--- a/Bootstrap-Portfolio-Assignment/Assignment_3_Report.docx
+++ b/Bootstrap-Portfolio-Assignment/Assignment_3_Report.docx
@@ -303,11 +303,15 @@
         <w:jc w:val="both"/>
         <w:rPr>
           <w:rFonts w:ascii="Times New Roman" w:hAnsi="Times New Roman" w:cs="Times New Roman"/>
+          <w:sz w:val="24"/>
+          <w:szCs w:val="24"/>
         </w:rPr>
       </w:pPr>
       <w:r>
         <w:rPr>
           <w:rFonts w:ascii="Times New Roman" w:hAnsi="Times New Roman" w:cs="Times New Roman"/>
+          <w:sz w:val="24"/>
+          <w:szCs w:val="24"/>
         </w:rPr>
         <w:t>I developed a fully responsive personal portfolio website using Bootstrap 5. The website presents my profile as a Computer Science undergraduate, AI/ML enthusiast, and full-stack web developer. It includes a responsive navbar, hero section, about section, sidebar profile card, skills section, project cards, services section, Bootstrap utilities showcase, contact/registration form with validation, and footer.</w:t>
       </w:r>
@@ -333,12 +337,15 @@
         <w:spacing w:after="40"/>
         <w:rPr>
           <w:rFonts w:ascii="Times New Roman" w:hAnsi="Times New Roman" w:cs="Times New Roman"/>
+          <w:sz w:val="24"/>
+          <w:szCs w:val="28"/>
         </w:rPr>
       </w:pPr>
       <w:r>
         <w:rPr>
           <w:rFonts w:ascii="Times New Roman" w:hAnsi="Times New Roman" w:cs="Times New Roman"/>
-          <w:sz w:val="20"/>
+          <w:sz w:val="24"/>
+          <w:szCs w:val="28"/>
         </w:rPr>
         <w:t>Bootstrap 5 CDN integration</w:t>
       </w:r>
@@ -349,12 +356,15 @@
         <w:spacing w:after="40"/>
         <w:rPr>
           <w:rFonts w:ascii="Times New Roman" w:hAnsi="Times New Roman" w:cs="Times New Roman"/>
+          <w:sz w:val="24"/>
+          <w:szCs w:val="28"/>
         </w:rPr>
       </w:pPr>
       <w:r>
         <w:rPr>
           <w:rFonts w:ascii="Times New Roman" w:hAnsi="Times New Roman" w:cs="Times New Roman"/>
-          <w:sz w:val="20"/>
+          <w:sz w:val="24"/>
+          <w:szCs w:val="28"/>
         </w:rPr>
         <w:t>Responsive layout using Bootstrap Grid System</w:t>
       </w:r>
@@ -365,12 +375,15 @@
         <w:spacing w:after="40"/>
         <w:rPr>
           <w:rFonts w:ascii="Times New Roman" w:hAnsi="Times New Roman" w:cs="Times New Roman"/>
+          <w:sz w:val="24"/>
+          <w:szCs w:val="28"/>
         </w:rPr>
       </w:pPr>
       <w:r>
         <w:rPr>
           <w:rFonts w:ascii="Times New Roman" w:hAnsi="Times New Roman" w:cs="Times New Roman"/>
-          <w:sz w:val="20"/>
+          <w:sz w:val="24"/>
+          <w:szCs w:val="28"/>
         </w:rPr>
         <w:t>Header, main content area, sidebar, and footer</w:t>
       </w:r>
@@ -381,12 +394,15 @@
         <w:spacing w:after="40"/>
         <w:rPr>
           <w:rFonts w:ascii="Times New Roman" w:hAnsi="Times New Roman" w:cs="Times New Roman"/>
+          <w:sz w:val="24"/>
+          <w:szCs w:val="28"/>
         </w:rPr>
       </w:pPr>
       <w:r>
         <w:rPr>
           <w:rFonts w:ascii="Times New Roman" w:hAnsi="Times New Roman" w:cs="Times New Roman"/>
-          <w:sz w:val="20"/>
+          <w:sz w:val="24"/>
+          <w:szCs w:val="28"/>
         </w:rPr>
         <w:t>Responsive navbar with brand, navigation links, dropdown menu, and mobile collapse</w:t>
       </w:r>
@@ -397,12 +413,15 @@
         <w:spacing w:after="40"/>
         <w:rPr>
           <w:rFonts w:ascii="Times New Roman" w:hAnsi="Times New Roman" w:cs="Times New Roman"/>
+          <w:sz w:val="24"/>
+          <w:szCs w:val="28"/>
         </w:rPr>
       </w:pPr>
       <w:r>
         <w:rPr>
           <w:rFonts w:ascii="Times New Roman" w:hAnsi="Times New Roman" w:cs="Times New Roman"/>
-          <w:sz w:val="20"/>
+          <w:sz w:val="24"/>
+          <w:szCs w:val="28"/>
         </w:rPr>
         <w:t>Bootstrap buttons with multiple styles</w:t>
       </w:r>
@@ -413,12 +432,15 @@
         <w:spacing w:after="40"/>
         <w:rPr>
           <w:rFonts w:ascii="Times New Roman" w:hAnsi="Times New Roman" w:cs="Times New Roman"/>
+          <w:sz w:val="24"/>
+          <w:szCs w:val="28"/>
         </w:rPr>
       </w:pPr>
       <w:r>
         <w:rPr>
           <w:rFonts w:ascii="Times New Roman" w:hAnsi="Times New Roman" w:cs="Times New Roman"/>
-          <w:sz w:val="20"/>
+          <w:sz w:val="24"/>
+          <w:szCs w:val="28"/>
         </w:rPr>
         <w:t>Bootstrap cards for projects and services</w:t>
       </w:r>
@@ -429,12 +451,15 @@
         <w:spacing w:after="40"/>
         <w:rPr>
           <w:rFonts w:ascii="Times New Roman" w:hAnsi="Times New Roman" w:cs="Times New Roman"/>
+          <w:sz w:val="24"/>
+          <w:szCs w:val="28"/>
         </w:rPr>
       </w:pPr>
       <w:r>
         <w:rPr>
           <w:rFonts w:ascii="Times New Roman" w:hAnsi="Times New Roman" w:cs="Times New Roman"/>
-          <w:sz w:val="20"/>
+          <w:sz w:val="24"/>
+          <w:szCs w:val="28"/>
         </w:rPr>
         <w:t>Badges for skills and technologies</w:t>
       </w:r>
@@ -445,12 +470,15 @@
         <w:spacing w:after="40"/>
         <w:rPr>
           <w:rFonts w:ascii="Times New Roman" w:hAnsi="Times New Roman" w:cs="Times New Roman"/>
+          <w:sz w:val="24"/>
+          <w:szCs w:val="28"/>
         </w:rPr>
       </w:pPr>
       <w:r>
         <w:rPr>
           <w:rFonts w:ascii="Times New Roman" w:hAnsi="Times New Roman" w:cs="Times New Roman"/>
-          <w:sz w:val="20"/>
+          <w:sz w:val="24"/>
+          <w:szCs w:val="28"/>
         </w:rPr>
         <w:t>Alert component for availability/collaboration message</w:t>
       </w:r>
@@ -461,12 +489,15 @@
         <w:spacing w:after="40"/>
         <w:rPr>
           <w:rFonts w:ascii="Times New Roman" w:hAnsi="Times New Roman" w:cs="Times New Roman"/>
+          <w:sz w:val="24"/>
+          <w:szCs w:val="28"/>
         </w:rPr>
       </w:pPr>
       <w:r>
         <w:rPr>
           <w:rFonts w:ascii="Times New Roman" w:hAnsi="Times New Roman" w:cs="Times New Roman"/>
-          <w:sz w:val="20"/>
+          <w:sz w:val="24"/>
+          <w:szCs w:val="28"/>
         </w:rPr>
         <w:t>Contact/registration form with validation feedback</w:t>
       </w:r>
@@ -477,12 +508,15 @@
         <w:spacing w:after="40"/>
         <w:rPr>
           <w:rFonts w:ascii="Times New Roman" w:hAnsi="Times New Roman" w:cs="Times New Roman"/>
+          <w:sz w:val="24"/>
+          <w:szCs w:val="28"/>
         </w:rPr>
       </w:pPr>
       <w:r>
         <w:rPr>
           <w:rFonts w:ascii="Times New Roman" w:hAnsi="Times New Roman" w:cs="Times New Roman"/>
-          <w:sz w:val="20"/>
+          <w:sz w:val="24"/>
+          <w:szCs w:val="28"/>
         </w:rPr>
         <w:t>Bootstrap utility classes for spacing, alignment, colors, borders, shadows, and display behavior</w:t>
       </w:r>
@@ -493,12 +527,15 @@
         <w:spacing w:after="40"/>
         <w:rPr>
           <w:rFonts w:ascii="Times New Roman" w:hAnsi="Times New Roman" w:cs="Times New Roman"/>
+          <w:sz w:val="24"/>
+          <w:szCs w:val="28"/>
         </w:rPr>
       </w:pPr>
       <w:r>
         <w:rPr>
           <w:rFonts w:ascii="Times New Roman" w:hAnsi="Times New Roman" w:cs="Times New Roman"/>
-          <w:sz w:val="20"/>
+          <w:sz w:val="24"/>
+          <w:szCs w:val="28"/>
         </w:rPr>
         <w:t>Custom CSS for navbar colors, hero styling, cards, buttons, hover effects, fonts, and responsive improvements</w:t>
       </w:r>
@@ -509,15 +546,50 @@
         <w:spacing w:after="40"/>
         <w:rPr>
           <w:rFonts w:ascii="Times New Roman" w:hAnsi="Times New Roman" w:cs="Times New Roman"/>
+          <w:sz w:val="24"/>
+          <w:szCs w:val="28"/>
         </w:rPr>
       </w:pPr>
       <w:r>
         <w:rPr>
           <w:rFonts w:ascii="Times New Roman" w:hAnsi="Times New Roman" w:cs="Times New Roman"/>
-          <w:sz w:val="20"/>
+          <w:sz w:val="24"/>
+          <w:szCs w:val="28"/>
         </w:rPr>
         <w:t>Fully responsive design for mobile, tablet, and desktop screens</w:t>
       </w:r>
+    </w:p>
+    <w:p>
+      <w:pPr>
+        <w:pStyle w:val="ListBullet"/>
+        <w:numPr>
+          <w:ilvl w:val="0"/>
+          <w:numId w:val="0"/>
+        </w:numPr>
+        <w:spacing w:after="40"/>
+        <w:ind w:left="360" w:hanging="360"/>
+        <w:rPr>
+          <w:rFonts w:ascii="Times New Roman" w:hAnsi="Times New Roman" w:cs="Times New Roman"/>
+          <w:sz w:val="24"/>
+          <w:szCs w:val="28"/>
+        </w:rPr>
+      </w:pPr>
+    </w:p>
+    <w:p>
+      <w:pPr>
+        <w:pStyle w:val="ListBullet"/>
+        <w:numPr>
+          <w:ilvl w:val="0"/>
+          <w:numId w:val="0"/>
+        </w:numPr>
+        <w:spacing w:after="40"/>
+        <w:ind w:left="360" w:hanging="360"/>
+        <w:rPr>
+          <w:rFonts w:ascii="Times New Roman" w:hAnsi="Times New Roman" w:cs="Times New Roman"/>
+          <w:sz w:val="24"/>
+          <w:szCs w:val="28"/>
+        </w:rPr>
+      </w:pPr>
     </w:p>
     <w:p>
       <w:pPr>
@@ -531,6 +603,7 @@
           <w:rFonts w:ascii="Times New Roman" w:hAnsi="Times New Roman" w:cs="Times New Roman"/>
           <w:color w:val="174B69"/>
         </w:rPr>
+        <w:lastRenderedPageBreak/>
         <w:t>Technologies Used</w:t>
       </w:r>
     </w:p>
@@ -758,7 +831,6 @@
                 <w:b/>
                 <w:sz w:val="20"/>
               </w:rPr>
-              <w:lastRenderedPageBreak/>
               <w:t>Bootstrap Icons</w:t>
             </w:r>
           </w:p>
@@ -1578,49 +1650,296 @@
         <w:tblLook w:val="04A0" w:firstRow="1" w:lastRow="0" w:firstColumn="1" w:lastColumn="0" w:noHBand="0" w:noVBand="1"/>
       </w:tblPr>
       <w:tblGrid>
-        <w:gridCol w:w="10080"/>
+        <w:gridCol w:w="10044"/>
       </w:tblGrid>
       <w:tr>
         <w:trPr>
-          <w:trHeight w:hRule="exact" w:val="1944"/>
+          <w:trHeight w:hRule="exact" w:val="6081"/>
           <w:jc w:val="center"/>
         </w:trPr>
         <w:tc>
           <w:tcPr>
-            <w:tcW w:w="10080" w:type="dxa"/>
+            <w:tcW w:w="10044" w:type="dxa"/>
             <w:shd w:val="clear" w:color="auto" w:fill="F8FAFC"/>
             <w:vAlign w:val="center"/>
           </w:tcPr>
           <w:p>
-            <w:pPr>
-              <w:jc w:val="center"/>
-            </w:pPr>
-            <w:r/>
             <w:r>
               <w:rPr>
-                <w:b/>
-                <w:sz w:val="22"/>
+                <w:noProof/>
               </w:rPr>
-              <w:t>Screenshot 1: Desktop Hero Section</w:t>
+              <w:drawing>
+                <wp:inline distT="0" distB="0" distL="0" distR="0" wp14:anchorId="13466288" wp14:editId="48B64D03">
+                  <wp:extent cx="6210300" cy="3784401"/>
+                  <wp:effectExtent l="0" t="0" r="0" b="6985"/>
+                  <wp:docPr id="1" name="Picture 1"/>
+                  <wp:cNvGraphicFramePr>
+                    <a:graphicFrameLocks xmlns:a="http://schemas.openxmlformats.org/drawingml/2006/main" noChangeAspect="1"/>
+                  </wp:cNvGraphicFramePr>
+                  <a:graphic xmlns:a="http://schemas.openxmlformats.org/drawingml/2006/main">
+                    <a:graphicData uri="http://schemas.openxmlformats.org/drawingml/2006/picture">
+                      <pic:pic xmlns:pic="http://schemas.openxmlformats.org/drawingml/2006/picture">
+                        <pic:nvPicPr>
+                          <pic:cNvPr id="0" name="01_desktop_hero.png"/>
+                          <pic:cNvPicPr/>
+                        </pic:nvPicPr>
+                        <pic:blipFill>
+                          <a:blip r:embed="rId8"/>
+                          <a:stretch>
+                            <a:fillRect/>
+                          </a:stretch>
+                        </pic:blipFill>
+                        <pic:spPr>
+                          <a:xfrm>
+                            <a:off x="0" y="0"/>
+                            <a:ext cx="6220241" cy="3790459"/>
+                          </a:xfrm>
+                          <a:prstGeom prst="rect">
+                            <a:avLst/>
+                          </a:prstGeom>
+                        </pic:spPr>
+                      </pic:pic>
+                    </a:graphicData>
+                  </a:graphic>
+                </wp:inline>
+              </w:drawing>
             </w:r>
           </w:p>
           <w:p>
             <w:pPr>
               <w:jc w:val="center"/>
             </w:pPr>
+          </w:p>
+        </w:tc>
+      </w:tr>
+    </w:tbl>
+    <w:p>
+      <w:pPr>
+        <w:spacing w:after="40"/>
+        <w:rPr>
+          <w:rFonts w:ascii="Times New Roman" w:hAnsi="Times New Roman" w:cs="Times New Roman"/>
+        </w:rPr>
+      </w:pPr>
+    </w:p>
+    <w:tbl>
+      <w:tblPr>
+        <w:tblW w:w="0" w:type="auto"/>
+        <w:jc w:val="center"/>
+        <w:tblBorders>
+          <w:top w:val="single" w:sz="6" w:space="0" w:color="D9E2EC"/>
+          <w:left w:val="single" w:sz="6" w:space="0" w:color="D9E2EC"/>
+          <w:bottom w:val="single" w:sz="6" w:space="0" w:color="D9E2EC"/>
+          <w:right w:val="single" w:sz="6" w:space="0" w:color="D9E2EC"/>
+          <w:insideH w:val="single" w:sz="6" w:space="0" w:color="D9E2EC"/>
+          <w:insideV w:val="single" w:sz="6" w:space="0" w:color="D9E2EC"/>
+        </w:tblBorders>
+        <w:tblLook w:val="04A0" w:firstRow="1" w:lastRow="0" w:firstColumn="1" w:lastColumn="0" w:noHBand="0" w:noVBand="1"/>
+      </w:tblPr>
+      <w:tblGrid>
+        <w:gridCol w:w="10061"/>
+      </w:tblGrid>
+      <w:tr>
+        <w:trPr>
+          <w:trHeight w:hRule="exact" w:val="6476"/>
+          <w:jc w:val="center"/>
+        </w:trPr>
+        <w:tc>
+          <w:tcPr>
+            <w:tcW w:w="10061" w:type="dxa"/>
+            <w:shd w:val="clear" w:color="auto" w:fill="F8FAFC"/>
+            <w:vAlign w:val="center"/>
+          </w:tcPr>
+          <w:p>
             <w:r>
+              <w:rPr>
+                <w:noProof/>
+              </w:rPr>
               <w:drawing>
-                <wp:inline xmlns:a="http://schemas.openxmlformats.org/drawingml/2006/main" xmlns:pic="http://schemas.openxmlformats.org/drawingml/2006/picture">
-                  <wp:extent cx="5577840" cy="3398996"/>
-                  <wp:docPr id="1" name="Picture 1"/>
+                <wp:inline distT="0" distB="0" distL="0" distR="0" wp14:anchorId="205548EA" wp14:editId="5FC657FC">
+                  <wp:extent cx="6240780" cy="4030980"/>
+                  <wp:effectExtent l="0" t="0" r="7620" b="7620"/>
+                  <wp:docPr id="2" name="Picture 2"/>
                   <wp:cNvGraphicFramePr>
-                    <a:graphicFrameLocks noChangeAspect="1"/>
+                    <a:graphicFrameLocks xmlns:a="http://schemas.openxmlformats.org/drawingml/2006/main" noChangeAspect="1"/>
                   </wp:cNvGraphicFramePr>
-                  <a:graphic>
+                  <a:graphic xmlns:a="http://schemas.openxmlformats.org/drawingml/2006/main">
                     <a:graphicData uri="http://schemas.openxmlformats.org/drawingml/2006/picture">
-                      <pic:pic>
+                      <pic:pic xmlns:pic="http://schemas.openxmlformats.org/drawingml/2006/picture">
                         <pic:nvPicPr>
-                          <pic:cNvPr id="0" name="01_desktop_hero.png"/>
+                          <pic:cNvPr id="0" name="02_about_sidebar.png"/>
+                          <pic:cNvPicPr/>
+                        </pic:nvPicPr>
+                        <pic:blipFill>
+                          <a:blip r:embed="rId9"/>
+                          <a:stretch>
+                            <a:fillRect/>
+                          </a:stretch>
+                        </pic:blipFill>
+                        <pic:spPr>
+                          <a:xfrm>
+                            <a:off x="0" y="0"/>
+                            <a:ext cx="6280446" cy="4056601"/>
+                          </a:xfrm>
+                          <a:prstGeom prst="rect">
+                            <a:avLst/>
+                          </a:prstGeom>
+                        </pic:spPr>
+                      </pic:pic>
+                    </a:graphicData>
+                  </a:graphic>
+                </wp:inline>
+              </w:drawing>
+            </w:r>
+          </w:p>
+          <w:p>
+            <w:pPr>
+              <w:jc w:val="center"/>
+            </w:pPr>
+          </w:p>
+        </w:tc>
+      </w:tr>
+    </w:tbl>
+    <w:p>
+      <w:pPr>
+        <w:spacing w:after="40"/>
+        <w:rPr>
+          <w:rFonts w:ascii="Times New Roman" w:hAnsi="Times New Roman" w:cs="Times New Roman"/>
+        </w:rPr>
+      </w:pPr>
+    </w:p>
+    <w:tbl>
+      <w:tblPr>
+        <w:tblW w:w="0" w:type="auto"/>
+        <w:jc w:val="center"/>
+        <w:tblBorders>
+          <w:top w:val="single" w:sz="6" w:space="0" w:color="D9E2EC"/>
+          <w:left w:val="single" w:sz="6" w:space="0" w:color="D9E2EC"/>
+          <w:bottom w:val="single" w:sz="6" w:space="0" w:color="D9E2EC"/>
+          <w:right w:val="single" w:sz="6" w:space="0" w:color="D9E2EC"/>
+          <w:insideH w:val="single" w:sz="6" w:space="0" w:color="D9E2EC"/>
+          <w:insideV w:val="single" w:sz="6" w:space="0" w:color="D9E2EC"/>
+        </w:tblBorders>
+        <w:tblLook w:val="04A0" w:firstRow="1" w:lastRow="0" w:firstColumn="1" w:lastColumn="0" w:noHBand="0" w:noVBand="1"/>
+      </w:tblPr>
+      <w:tblGrid>
+        <w:gridCol w:w="10092"/>
+      </w:tblGrid>
+      <w:tr>
+        <w:trPr>
+          <w:trHeight w:hRule="exact" w:val="5877"/>
+          <w:jc w:val="center"/>
+        </w:trPr>
+        <w:tc>
+          <w:tcPr>
+            <w:tcW w:w="10068" w:type="dxa"/>
+            <w:shd w:val="clear" w:color="auto" w:fill="F8FAFC"/>
+            <w:vAlign w:val="center"/>
+          </w:tcPr>
+          <w:p>
+            <w:r>
+              <w:rPr>
+                <w:noProof/>
+              </w:rPr>
+              <w:lastRenderedPageBreak/>
+              <w:drawing>
+                <wp:inline distT="0" distB="0" distL="0" distR="0" wp14:anchorId="34871862" wp14:editId="35962A2A">
+                  <wp:extent cx="6271260" cy="3665220"/>
+                  <wp:effectExtent l="0" t="0" r="0" b="0"/>
+                  <wp:docPr id="3" name="Picture 3"/>
+                  <wp:cNvGraphicFramePr>
+                    <a:graphicFrameLocks xmlns:a="http://schemas.openxmlformats.org/drawingml/2006/main" noChangeAspect="1"/>
+                  </wp:cNvGraphicFramePr>
+                  <a:graphic xmlns:a="http://schemas.openxmlformats.org/drawingml/2006/main">
+                    <a:graphicData uri="http://schemas.openxmlformats.org/drawingml/2006/picture">
+                      <pic:pic xmlns:pic="http://schemas.openxmlformats.org/drawingml/2006/picture">
+                        <pic:nvPicPr>
+                          <pic:cNvPr id="0" name="03_technical_skills.png"/>
+                          <pic:cNvPicPr/>
+                        </pic:nvPicPr>
+                        <pic:blipFill>
+                          <a:blip r:embed="rId10"/>
+                          <a:stretch>
+                            <a:fillRect/>
+                          </a:stretch>
+                        </pic:blipFill>
+                        <pic:spPr>
+                          <a:xfrm>
+                            <a:off x="0" y="0"/>
+                            <a:ext cx="6272174" cy="3665754"/>
+                          </a:xfrm>
+                          <a:prstGeom prst="rect">
+                            <a:avLst/>
+                          </a:prstGeom>
+                        </pic:spPr>
+                      </pic:pic>
+                    </a:graphicData>
+                  </a:graphic>
+                </wp:inline>
+              </w:drawing>
+            </w:r>
+          </w:p>
+          <w:p>
+            <w:pPr>
+              <w:jc w:val="center"/>
+            </w:pPr>
+          </w:p>
+        </w:tc>
+      </w:tr>
+    </w:tbl>
+    <w:p>
+      <w:pPr>
+        <w:spacing w:after="40"/>
+        <w:rPr>
+          <w:rFonts w:ascii="Times New Roman" w:hAnsi="Times New Roman" w:cs="Times New Roman"/>
+        </w:rPr>
+      </w:pPr>
+    </w:p>
+    <w:tbl>
+      <w:tblPr>
+        <w:tblW w:w="0" w:type="auto"/>
+        <w:jc w:val="center"/>
+        <w:tblBorders>
+          <w:top w:val="single" w:sz="6" w:space="0" w:color="D9E2EC"/>
+          <w:left w:val="single" w:sz="6" w:space="0" w:color="D9E2EC"/>
+          <w:bottom w:val="single" w:sz="6" w:space="0" w:color="D9E2EC"/>
+          <w:right w:val="single" w:sz="6" w:space="0" w:color="D9E2EC"/>
+          <w:insideH w:val="single" w:sz="6" w:space="0" w:color="D9E2EC"/>
+          <w:insideV w:val="single" w:sz="6" w:space="0" w:color="D9E2EC"/>
+        </w:tblBorders>
+        <w:tblLook w:val="04A0" w:firstRow="1" w:lastRow="0" w:firstColumn="1" w:lastColumn="0" w:noHBand="0" w:noVBand="1"/>
+      </w:tblPr>
+      <w:tblGrid>
+        <w:gridCol w:w="10008"/>
+      </w:tblGrid>
+      <w:tr>
+        <w:trPr>
+          <w:trHeight w:hRule="exact" w:val="7281"/>
+          <w:jc w:val="center"/>
+        </w:trPr>
+        <w:tc>
+          <w:tcPr>
+            <w:tcW w:w="10008" w:type="dxa"/>
+            <w:shd w:val="clear" w:color="auto" w:fill="F8FAFC"/>
+            <w:vAlign w:val="center"/>
+          </w:tcPr>
+          <w:p>
+            <w:r>
+              <w:rPr>
+                <w:noProof/>
+              </w:rPr>
+              <w:drawing>
+                <wp:inline distT="0" distB="0" distL="0" distR="0" wp14:anchorId="7E879EF5" wp14:editId="24A59338">
+                  <wp:extent cx="6163728" cy="4556760"/>
+                  <wp:effectExtent l="0" t="0" r="8890" b="0"/>
+                  <wp:docPr id="4" name="Picture 4"/>
+                  <wp:cNvGraphicFramePr>
+                    <a:graphicFrameLocks xmlns:a="http://schemas.openxmlformats.org/drawingml/2006/main" noChangeAspect="1"/>
+                  </wp:cNvGraphicFramePr>
+                  <a:graphic xmlns:a="http://schemas.openxmlformats.org/drawingml/2006/main">
+                    <a:graphicData uri="http://schemas.openxmlformats.org/drawingml/2006/picture">
+                      <pic:pic xmlns:pic="http://schemas.openxmlformats.org/drawingml/2006/picture">
+                        <pic:nvPicPr>
+                          <pic:cNvPr id="0" name="04_project_cards.png"/>
                           <pic:cNvPicPr/>
                         </pic:nvPicPr>
                         <pic:blipFill>
@@ -1632,9 +1951,97 @@
                         <pic:spPr>
                           <a:xfrm>
                             <a:off x="0" y="0"/>
-                            <a:ext cx="5577840" cy="3398996"/>
+                            <a:ext cx="6189222" cy="4575607"/>
                           </a:xfrm>
-                          <a:prstGeom prst="rect"/>
+                          <a:prstGeom prst="rect">
+                            <a:avLst/>
+                          </a:prstGeom>
+                        </pic:spPr>
+                      </pic:pic>
+                    </a:graphicData>
+                  </a:graphic>
+                </wp:inline>
+              </w:drawing>
+            </w:r>
+          </w:p>
+          <w:p>
+            <w:pPr>
+              <w:jc w:val="center"/>
+            </w:pPr>
+          </w:p>
+        </w:tc>
+      </w:tr>
+    </w:tbl>
+    <w:p>
+      <w:pPr>
+        <w:rPr>
+          <w:rFonts w:ascii="Times New Roman" w:hAnsi="Times New Roman" w:cs="Times New Roman"/>
+        </w:rPr>
+      </w:pPr>
+    </w:p>
+    <w:tbl>
+      <w:tblPr>
+        <w:tblW w:w="10497" w:type="dxa"/>
+        <w:jc w:val="center"/>
+        <w:tblBorders>
+          <w:top w:val="single" w:sz="6" w:space="0" w:color="D9E2EC"/>
+          <w:left w:val="single" w:sz="6" w:space="0" w:color="D9E2EC"/>
+          <w:bottom w:val="single" w:sz="6" w:space="0" w:color="D9E2EC"/>
+          <w:right w:val="single" w:sz="6" w:space="0" w:color="D9E2EC"/>
+          <w:insideH w:val="single" w:sz="6" w:space="0" w:color="D9E2EC"/>
+          <w:insideV w:val="single" w:sz="6" w:space="0" w:color="D9E2EC"/>
+        </w:tblBorders>
+        <w:tblLook w:val="04A0" w:firstRow="1" w:lastRow="0" w:firstColumn="1" w:lastColumn="0" w:noHBand="0" w:noVBand="1"/>
+      </w:tblPr>
+      <w:tblGrid>
+        <w:gridCol w:w="10536"/>
+      </w:tblGrid>
+      <w:tr>
+        <w:trPr>
+          <w:trHeight w:hRule="exact" w:val="6932"/>
+          <w:jc w:val="center"/>
+        </w:trPr>
+        <w:tc>
+          <w:tcPr>
+            <w:tcW w:w="10497" w:type="dxa"/>
+            <w:shd w:val="clear" w:color="auto" w:fill="F8FAFC"/>
+            <w:vAlign w:val="center"/>
+          </w:tcPr>
+          <w:p>
+            <w:r>
+              <w:rPr>
+                <w:noProof/>
+              </w:rPr>
+              <w:lastRenderedPageBreak/>
+              <w:drawing>
+                <wp:inline distT="0" distB="0" distL="0" distR="0" wp14:anchorId="535B6245" wp14:editId="7E45B2EE">
+                  <wp:extent cx="6545580" cy="4114607"/>
+                  <wp:effectExtent l="0" t="0" r="7620" b="635"/>
+                  <wp:docPr id="5" name="Picture 5"/>
+                  <wp:cNvGraphicFramePr>
+                    <a:graphicFrameLocks xmlns:a="http://schemas.openxmlformats.org/drawingml/2006/main" noChangeAspect="1"/>
+                  </wp:cNvGraphicFramePr>
+                  <a:graphic xmlns:a="http://schemas.openxmlformats.org/drawingml/2006/main">
+                    <a:graphicData uri="http://schemas.openxmlformats.org/drawingml/2006/picture">
+                      <pic:pic xmlns:pic="http://schemas.openxmlformats.org/drawingml/2006/picture">
+                        <pic:nvPicPr>
+                          <pic:cNvPr id="0" name="05_services_cards.png"/>
+                          <pic:cNvPicPr/>
+                        </pic:nvPicPr>
+                        <pic:blipFill>
+                          <a:blip r:embed="rId12"/>
+                          <a:stretch>
+                            <a:fillRect/>
+                          </a:stretch>
+                        </pic:blipFill>
+                        <pic:spPr>
+                          <a:xfrm>
+                            <a:off x="0" y="0"/>
+                            <a:ext cx="6561636" cy="4124700"/>
+                          </a:xfrm>
+                          <a:prstGeom prst="rect">
+                            <a:avLst/>
+                          </a:prstGeom>
                         </pic:spPr>
                       </pic:pic>
                     </a:graphicData>
@@ -1669,53 +2076,41 @@
         <w:tblLook w:val="04A0" w:firstRow="1" w:lastRow="0" w:firstColumn="1" w:lastColumn="0" w:noHBand="0" w:noVBand="1"/>
       </w:tblPr>
       <w:tblGrid>
-        <w:gridCol w:w="10080"/>
+        <w:gridCol w:w="10271"/>
       </w:tblGrid>
       <w:tr>
         <w:trPr>
-          <w:trHeight w:hRule="exact" w:val="1944"/>
+          <w:trHeight w:hRule="exact" w:val="6477"/>
           <w:jc w:val="center"/>
         </w:trPr>
         <w:tc>
           <w:tcPr>
-            <w:tcW w:w="10080" w:type="dxa"/>
+            <w:tcW w:w="10271" w:type="dxa"/>
             <w:shd w:val="clear" w:color="auto" w:fill="F8FAFC"/>
             <w:vAlign w:val="center"/>
           </w:tcPr>
           <w:p>
-            <w:pPr>
-              <w:jc w:val="center"/>
-            </w:pPr>
-            <w:r/>
             <w:r>
               <w:rPr>
-                <w:b/>
-                <w:sz w:val="22"/>
+                <w:noProof/>
               </w:rPr>
-              <w:t>Screenshot 2: About Section &amp; Sidebar</w:t>
-            </w:r>
-          </w:p>
-          <w:p>
-            <w:pPr>
-              <w:jc w:val="center"/>
-            </w:pPr>
-            <w:r>
               <w:drawing>
-                <wp:inline xmlns:a="http://schemas.openxmlformats.org/drawingml/2006/main" xmlns:pic="http://schemas.openxmlformats.org/drawingml/2006/picture">
-                  <wp:extent cx="5577840" cy="3913203"/>
-                  <wp:docPr id="2" name="Picture 2"/>
+                <wp:inline distT="0" distB="0" distL="0" distR="0" wp14:anchorId="7D11D85B" wp14:editId="320E8841">
+                  <wp:extent cx="6332220" cy="4076700"/>
+                  <wp:effectExtent l="0" t="0" r="0" b="0"/>
+                  <wp:docPr id="6" name="Picture 6"/>
                   <wp:cNvGraphicFramePr>
-                    <a:graphicFrameLocks noChangeAspect="1"/>
+                    <a:graphicFrameLocks xmlns:a="http://schemas.openxmlformats.org/drawingml/2006/main" noChangeAspect="1"/>
                   </wp:cNvGraphicFramePr>
-                  <a:graphic>
+                  <a:graphic xmlns:a="http://schemas.openxmlformats.org/drawingml/2006/main">
                     <a:graphicData uri="http://schemas.openxmlformats.org/drawingml/2006/picture">
-                      <pic:pic>
+                      <pic:pic xmlns:pic="http://schemas.openxmlformats.org/drawingml/2006/picture">
                         <pic:nvPicPr>
-                          <pic:cNvPr id="0" name="02_about_sidebar.png"/>
+                          <pic:cNvPr id="0" name="06_utilities_showcase.png"/>
                           <pic:cNvPicPr/>
                         </pic:nvPicPr>
                         <pic:blipFill>
-                          <a:blip r:embed="rId12"/>
+                          <a:blip r:embed="rId13"/>
                           <a:stretch>
                             <a:fillRect/>
                           </a:stretch>
@@ -1723,9 +2118,11 @@
                         <pic:spPr>
                           <a:xfrm>
                             <a:off x="0" y="0"/>
-                            <a:ext cx="5577840" cy="3913203"/>
+                            <a:ext cx="6346094" cy="4085632"/>
                           </a:xfrm>
-                          <a:prstGeom prst="rect"/>
+                          <a:prstGeom prst="rect">
+                            <a:avLst/>
+                          </a:prstGeom>
                         </pic:spPr>
                       </pic:pic>
                     </a:graphicData>
@@ -1733,6 +2130,11 @@
                 </wp:inline>
               </w:drawing>
             </w:r>
+          </w:p>
+          <w:p>
+            <w:pPr>
+              <w:jc w:val="center"/>
+            </w:pPr>
           </w:p>
         </w:tc>
       </w:tr>
@@ -1760,53 +2162,41 @@
         <w:tblLook w:val="04A0" w:firstRow="1" w:lastRow="0" w:firstColumn="1" w:lastColumn="0" w:noHBand="0" w:noVBand="1"/>
       </w:tblPr>
       <w:tblGrid>
-        <w:gridCol w:w="10080"/>
+        <w:gridCol w:w="10206"/>
       </w:tblGrid>
       <w:tr>
         <w:trPr>
-          <w:trHeight w:hRule="exact" w:val="1944"/>
+          <w:trHeight w:hRule="exact" w:val="4391"/>
           <w:jc w:val="center"/>
         </w:trPr>
         <w:tc>
           <w:tcPr>
-            <w:tcW w:w="10080" w:type="dxa"/>
+            <w:tcW w:w="10206" w:type="dxa"/>
             <w:shd w:val="clear" w:color="auto" w:fill="F8FAFC"/>
             <w:vAlign w:val="center"/>
           </w:tcPr>
           <w:p>
-            <w:pPr>
-              <w:jc w:val="center"/>
-            </w:pPr>
-            <w:r/>
             <w:r>
               <w:rPr>
-                <w:b/>
-                <w:sz w:val="22"/>
+                <w:noProof/>
               </w:rPr>
-              <w:t>Screenshot 3: Technical Skills</w:t>
-            </w:r>
-          </w:p>
-          <w:p>
-            <w:pPr>
-              <w:jc w:val="center"/>
-            </w:pPr>
-            <w:r>
               <w:drawing>
-                <wp:inline xmlns:a="http://schemas.openxmlformats.org/drawingml/2006/main" xmlns:pic="http://schemas.openxmlformats.org/drawingml/2006/picture">
-                  <wp:extent cx="5577840" cy="3995999"/>
-                  <wp:docPr id="3" name="Picture 3"/>
+                <wp:inline distT="0" distB="0" distL="0" distR="0" wp14:anchorId="78A38542" wp14:editId="791CCFB1">
+                  <wp:extent cx="5577662" cy="2644140"/>
+                  <wp:effectExtent l="0" t="0" r="4445" b="3810"/>
+                  <wp:docPr id="7" name="Picture 7"/>
                   <wp:cNvGraphicFramePr>
-                    <a:graphicFrameLocks noChangeAspect="1"/>
+                    <a:graphicFrameLocks xmlns:a="http://schemas.openxmlformats.org/drawingml/2006/main" noChangeAspect="1"/>
                   </wp:cNvGraphicFramePr>
-                  <a:graphic>
+                  <a:graphic xmlns:a="http://schemas.openxmlformats.org/drawingml/2006/main">
                     <a:graphicData uri="http://schemas.openxmlformats.org/drawingml/2006/picture">
-                      <pic:pic>
+                      <pic:pic xmlns:pic="http://schemas.openxmlformats.org/drawingml/2006/picture">
                         <pic:nvPicPr>
-                          <pic:cNvPr id="0" name="03_technical_skills.png"/>
+                          <pic:cNvPr id="0" name="07_contact_validation.png"/>
                           <pic:cNvPicPr/>
                         </pic:nvPicPr>
                         <pic:blipFill>
-                          <a:blip r:embed="rId13"/>
+                          <a:blip r:embed="rId14"/>
                           <a:stretch>
                             <a:fillRect/>
                           </a:stretch>
@@ -1814,9 +2204,84 @@
                         <pic:spPr>
                           <a:xfrm>
                             <a:off x="0" y="0"/>
-                            <a:ext cx="5577840" cy="3995999"/>
+                            <a:ext cx="5583782" cy="2647041"/>
                           </a:xfrm>
-                          <a:prstGeom prst="rect"/>
+                          <a:prstGeom prst="rect">
+                            <a:avLst/>
+                          </a:prstGeom>
+                        </pic:spPr>
+                      </pic:pic>
+                    </a:graphicData>
+                  </a:graphic>
+                </wp:inline>
+              </w:drawing>
+            </w:r>
+          </w:p>
+          <w:p>
+            <w:pPr>
+              <w:jc w:val="center"/>
+            </w:pPr>
+          </w:p>
+        </w:tc>
+      </w:tr>
+      <w:tr>
+        <w:tblPrEx>
+          <w:tblBorders>
+            <w:top w:val="none" w:sz="0" w:space="0" w:color="auto"/>
+            <w:left w:val="none" w:sz="0" w:space="0" w:color="auto"/>
+            <w:bottom w:val="none" w:sz="0" w:space="0" w:color="auto"/>
+            <w:right w:val="none" w:sz="0" w:space="0" w:color="auto"/>
+            <w:insideH w:val="none" w:sz="0" w:space="0" w:color="auto"/>
+            <w:insideV w:val="none" w:sz="0" w:space="0" w:color="auto"/>
+          </w:tblBorders>
+        </w:tblPrEx>
+        <w:trPr>
+          <w:trHeight w:val="2195"/>
+          <w:jc w:val="center"/>
+        </w:trPr>
+        <w:tc>
+          <w:tcPr>
+            <w:tcW w:w="10206" w:type="dxa"/>
+            <w:vAlign w:val="center"/>
+          </w:tcPr>
+          <w:p/>
+          <w:p>
+            <w:pPr>
+              <w:jc w:val="center"/>
+            </w:pPr>
+            <w:r>
+              <w:rPr>
+                <w:noProof/>
+              </w:rPr>
+              <w:drawing>
+                <wp:inline distT="0" distB="0" distL="0" distR="0" wp14:anchorId="5C456DCA" wp14:editId="6E91D644">
+                  <wp:extent cx="5577840" cy="1533906"/>
+                  <wp:effectExtent l="0" t="0" r="0" b="0"/>
+                  <wp:docPr id="8" name="Picture 8"/>
+                  <wp:cNvGraphicFramePr>
+                    <a:graphicFrameLocks xmlns:a="http://schemas.openxmlformats.org/drawingml/2006/main" noChangeAspect="1"/>
+                  </wp:cNvGraphicFramePr>
+                  <a:graphic xmlns:a="http://schemas.openxmlformats.org/drawingml/2006/main">
+                    <a:graphicData uri="http://schemas.openxmlformats.org/drawingml/2006/picture">
+                      <pic:pic xmlns:pic="http://schemas.openxmlformats.org/drawingml/2006/picture">
+                        <pic:nvPicPr>
+                          <pic:cNvPr id="0" name="08_footer_details.png"/>
+                          <pic:cNvPicPr/>
+                        </pic:nvPicPr>
+                        <pic:blipFill>
+                          <a:blip r:embed="rId15"/>
+                          <a:stretch>
+                            <a:fillRect/>
+                          </a:stretch>
+                        </pic:blipFill>
+                        <pic:spPr>
+                          <a:xfrm>
+                            <a:off x="0" y="0"/>
+                            <a:ext cx="5577840" cy="1533906"/>
+                          </a:xfrm>
+                          <a:prstGeom prst="rect">
+                            <a:avLst/>
+                          </a:prstGeom>
                         </pic:spPr>
                       </pic:pic>
                     </a:graphicData>
@@ -1836,445 +2301,6 @@
         </w:rPr>
       </w:pPr>
     </w:p>
-    <w:tbl>
-      <w:tblPr>
-        <w:tblW w:w="0" w:type="auto"/>
-        <w:jc w:val="center"/>
-        <w:tblBorders>
-          <w:top w:val="single" w:sz="6" w:space="0" w:color="D9E2EC"/>
-          <w:left w:val="single" w:sz="6" w:space="0" w:color="D9E2EC"/>
-          <w:bottom w:val="single" w:sz="6" w:space="0" w:color="D9E2EC"/>
-          <w:right w:val="single" w:sz="6" w:space="0" w:color="D9E2EC"/>
-          <w:insideH w:val="single" w:sz="6" w:space="0" w:color="D9E2EC"/>
-          <w:insideV w:val="single" w:sz="6" w:space="0" w:color="D9E2EC"/>
-        </w:tblBorders>
-        <w:tblLook w:val="04A0" w:firstRow="1" w:lastRow="0" w:firstColumn="1" w:lastColumn="0" w:noHBand="0" w:noVBand="1"/>
-      </w:tblPr>
-      <w:tblGrid>
-        <w:gridCol w:w="10080"/>
-      </w:tblGrid>
-      <w:tr>
-        <w:trPr>
-          <w:trHeight w:hRule="exact" w:val="1944"/>
-          <w:jc w:val="center"/>
-        </w:trPr>
-        <w:tc>
-          <w:tcPr>
-            <w:tcW w:w="10080" w:type="dxa"/>
-            <w:shd w:val="clear" w:color="auto" w:fill="F8FAFC"/>
-            <w:vAlign w:val="center"/>
-          </w:tcPr>
-          <w:p>
-            <w:pPr>
-              <w:jc w:val="center"/>
-            </w:pPr>
-            <w:r/>
-            <w:r>
-              <w:rPr>
-                <w:b/>
-                <w:sz w:val="22"/>
-              </w:rPr>
-              <w:t>Screenshot 4: Project Cards</w:t>
-            </w:r>
-          </w:p>
-          <w:p>
-            <w:pPr>
-              <w:jc w:val="center"/>
-            </w:pPr>
-            <w:r>
-              <w:drawing>
-                <wp:inline xmlns:a="http://schemas.openxmlformats.org/drawingml/2006/main" xmlns:pic="http://schemas.openxmlformats.org/drawingml/2006/picture">
-                  <wp:extent cx="5577840" cy="5455825"/>
-                  <wp:docPr id="4" name="Picture 4"/>
-                  <wp:cNvGraphicFramePr>
-                    <a:graphicFrameLocks noChangeAspect="1"/>
-                  </wp:cNvGraphicFramePr>
-                  <a:graphic>
-                    <a:graphicData uri="http://schemas.openxmlformats.org/drawingml/2006/picture">
-                      <pic:pic>
-                        <pic:nvPicPr>
-                          <pic:cNvPr id="0" name="04_project_cards.png"/>
-                          <pic:cNvPicPr/>
-                        </pic:nvPicPr>
-                        <pic:blipFill>
-                          <a:blip r:embed="rId14"/>
-                          <a:stretch>
-                            <a:fillRect/>
-                          </a:stretch>
-                        </pic:blipFill>
-                        <pic:spPr>
-                          <a:xfrm>
-                            <a:off x="0" y="0"/>
-                            <a:ext cx="5577840" cy="5455825"/>
-                          </a:xfrm>
-                          <a:prstGeom prst="rect"/>
-                        </pic:spPr>
-                      </pic:pic>
-                    </a:graphicData>
-                  </a:graphic>
-                </wp:inline>
-              </w:drawing>
-            </w:r>
-          </w:p>
-        </w:tc>
-      </w:tr>
-    </w:tbl>
-    <w:p>
-      <w:pPr>
-        <w:spacing w:after="40"/>
-        <w:rPr>
-          <w:rFonts w:ascii="Times New Roman" w:hAnsi="Times New Roman" w:cs="Times New Roman"/>
-        </w:rPr>
-      </w:pPr>
-    </w:p>
-    <w:p>
-      <w:pPr>
-        <w:rPr>
-          <w:rFonts w:ascii="Times New Roman" w:hAnsi="Times New Roman" w:cs="Times New Roman"/>
-        </w:rPr>
-      </w:pPr>
-      <w:r>
-        <w:rPr>
-          <w:rFonts w:ascii="Times New Roman" w:hAnsi="Times New Roman" w:cs="Times New Roman"/>
-        </w:rPr>
-        <w:br w:type="page"/>
-      </w:r>
-    </w:p>
-    <w:tbl>
-      <w:tblPr>
-        <w:tblW w:w="0" w:type="auto"/>
-        <w:jc w:val="center"/>
-        <w:tblBorders>
-          <w:top w:val="single" w:sz="6" w:space="0" w:color="D9E2EC"/>
-          <w:left w:val="single" w:sz="6" w:space="0" w:color="D9E2EC"/>
-          <w:bottom w:val="single" w:sz="6" w:space="0" w:color="D9E2EC"/>
-          <w:right w:val="single" w:sz="6" w:space="0" w:color="D9E2EC"/>
-          <w:insideH w:val="single" w:sz="6" w:space="0" w:color="D9E2EC"/>
-          <w:insideV w:val="single" w:sz="6" w:space="0" w:color="D9E2EC"/>
-        </w:tblBorders>
-        <w:tblLook w:val="04A0" w:firstRow="1" w:lastRow="0" w:firstColumn="1" w:lastColumn="0" w:noHBand="0" w:noVBand="1"/>
-      </w:tblPr>
-      <w:tblGrid>
-        <w:gridCol w:w="10080"/>
-      </w:tblGrid>
-      <w:tr>
-        <w:trPr>
-          <w:trHeight w:hRule="exact" w:val="1944"/>
-          <w:jc w:val="center"/>
-        </w:trPr>
-        <w:tc>
-          <w:tcPr>
-            <w:tcW w:w="10080" w:type="dxa"/>
-            <w:shd w:val="clear" w:color="auto" w:fill="F8FAFC"/>
-            <w:vAlign w:val="center"/>
-          </w:tcPr>
-          <w:p>
-            <w:pPr>
-              <w:jc w:val="center"/>
-            </w:pPr>
-            <w:r/>
-            <w:r>
-              <w:rPr>
-                <w:b/>
-                <w:sz w:val="22"/>
-              </w:rPr>
-              <w:t>Screenshot 5: Services Cards</w:t>
-            </w:r>
-          </w:p>
-          <w:p>
-            <w:pPr>
-              <w:jc w:val="center"/>
-            </w:pPr>
-            <w:r>
-              <w:drawing>
-                <wp:inline xmlns:a="http://schemas.openxmlformats.org/drawingml/2006/main" xmlns:pic="http://schemas.openxmlformats.org/drawingml/2006/picture">
-                  <wp:extent cx="5577840" cy="5464540"/>
-                  <wp:docPr id="5" name="Picture 5"/>
-                  <wp:cNvGraphicFramePr>
-                    <a:graphicFrameLocks noChangeAspect="1"/>
-                  </wp:cNvGraphicFramePr>
-                  <a:graphic>
-                    <a:graphicData uri="http://schemas.openxmlformats.org/drawingml/2006/picture">
-                      <pic:pic>
-                        <pic:nvPicPr>
-                          <pic:cNvPr id="0" name="05_services_cards.png"/>
-                          <pic:cNvPicPr/>
-                        </pic:nvPicPr>
-                        <pic:blipFill>
-                          <a:blip r:embed="rId15"/>
-                          <a:stretch>
-                            <a:fillRect/>
-                          </a:stretch>
-                        </pic:blipFill>
-                        <pic:spPr>
-                          <a:xfrm>
-                            <a:off x="0" y="0"/>
-                            <a:ext cx="5577840" cy="5464540"/>
-                          </a:xfrm>
-                          <a:prstGeom prst="rect"/>
-                        </pic:spPr>
-                      </pic:pic>
-                    </a:graphicData>
-                  </a:graphic>
-                </wp:inline>
-              </w:drawing>
-            </w:r>
-          </w:p>
-        </w:tc>
-      </w:tr>
-    </w:tbl>
-    <w:p>
-      <w:pPr>
-        <w:spacing w:after="40"/>
-        <w:rPr>
-          <w:rFonts w:ascii="Times New Roman" w:hAnsi="Times New Roman" w:cs="Times New Roman"/>
-        </w:rPr>
-      </w:pPr>
-    </w:p>
-    <w:tbl>
-      <w:tblPr>
-        <w:tblW w:w="0" w:type="auto"/>
-        <w:jc w:val="center"/>
-        <w:tblBorders>
-          <w:top w:val="single" w:sz="6" w:space="0" w:color="D9E2EC"/>
-          <w:left w:val="single" w:sz="6" w:space="0" w:color="D9E2EC"/>
-          <w:bottom w:val="single" w:sz="6" w:space="0" w:color="D9E2EC"/>
-          <w:right w:val="single" w:sz="6" w:space="0" w:color="D9E2EC"/>
-          <w:insideH w:val="single" w:sz="6" w:space="0" w:color="D9E2EC"/>
-          <w:insideV w:val="single" w:sz="6" w:space="0" w:color="D9E2EC"/>
-        </w:tblBorders>
-        <w:tblLook w:val="04A0" w:firstRow="1" w:lastRow="0" w:firstColumn="1" w:lastColumn="0" w:noHBand="0" w:noVBand="1"/>
-      </w:tblPr>
-      <w:tblGrid>
-        <w:gridCol w:w="10080"/>
-      </w:tblGrid>
-      <w:tr>
-        <w:trPr>
-          <w:trHeight w:hRule="exact" w:val="1944"/>
-          <w:jc w:val="center"/>
-        </w:trPr>
-        <w:tc>
-          <w:tcPr>
-            <w:tcW w:w="10080" w:type="dxa"/>
-            <w:shd w:val="clear" w:color="auto" w:fill="F8FAFC"/>
-            <w:vAlign w:val="center"/>
-          </w:tcPr>
-          <w:p>
-            <w:pPr>
-              <w:jc w:val="center"/>
-            </w:pPr>
-            <w:r/>
-            <w:r>
-              <w:rPr>
-                <w:b/>
-                <w:sz w:val="22"/>
-              </w:rPr>
-              <w:t>Screenshot 6: Bootstrap Utilities Showcase</w:t>
-            </w:r>
-          </w:p>
-          <w:p>
-            <w:pPr>
-              <w:jc w:val="center"/>
-            </w:pPr>
-            <w:r>
-              <w:drawing>
-                <wp:inline xmlns:a="http://schemas.openxmlformats.org/drawingml/2006/main" xmlns:pic="http://schemas.openxmlformats.org/drawingml/2006/picture">
-                  <wp:extent cx="5577840" cy="5412248"/>
-                  <wp:docPr id="6" name="Picture 6"/>
-                  <wp:cNvGraphicFramePr>
-                    <a:graphicFrameLocks noChangeAspect="1"/>
-                  </wp:cNvGraphicFramePr>
-                  <a:graphic>
-                    <a:graphicData uri="http://schemas.openxmlformats.org/drawingml/2006/picture">
-                      <pic:pic>
-                        <pic:nvPicPr>
-                          <pic:cNvPr id="0" name="06_utilities_showcase.png"/>
-                          <pic:cNvPicPr/>
-                        </pic:nvPicPr>
-                        <pic:blipFill>
-                          <a:blip r:embed="rId16"/>
-                          <a:stretch>
-                            <a:fillRect/>
-                          </a:stretch>
-                        </pic:blipFill>
-                        <pic:spPr>
-                          <a:xfrm>
-                            <a:off x="0" y="0"/>
-                            <a:ext cx="5577840" cy="5412248"/>
-                          </a:xfrm>
-                          <a:prstGeom prst="rect"/>
-                        </pic:spPr>
-                      </pic:pic>
-                    </a:graphicData>
-                  </a:graphic>
-                </wp:inline>
-              </w:drawing>
-            </w:r>
-          </w:p>
-        </w:tc>
-      </w:tr>
-    </w:tbl>
-    <w:p>
-      <w:pPr>
-        <w:spacing w:after="40"/>
-        <w:rPr>
-          <w:rFonts w:ascii="Times New Roman" w:hAnsi="Times New Roman" w:cs="Times New Roman"/>
-        </w:rPr>
-      </w:pPr>
-    </w:p>
-    <w:tbl>
-      <w:tblPr>
-        <w:tblW w:w="0" w:type="auto"/>
-        <w:jc w:val="center"/>
-        <w:tblBorders>
-          <w:top w:val="single" w:sz="6" w:space="0" w:color="D9E2EC"/>
-          <w:left w:val="single" w:sz="6" w:space="0" w:color="D9E2EC"/>
-          <w:bottom w:val="single" w:sz="6" w:space="0" w:color="D9E2EC"/>
-          <w:right w:val="single" w:sz="6" w:space="0" w:color="D9E2EC"/>
-          <w:insideH w:val="single" w:sz="6" w:space="0" w:color="D9E2EC"/>
-          <w:insideV w:val="single" w:sz="6" w:space="0" w:color="D9E2EC"/>
-        </w:tblBorders>
-        <w:tblLook w:val="04A0" w:firstRow="1" w:lastRow="0" w:firstColumn="1" w:lastColumn="0" w:noHBand="0" w:noVBand="1"/>
-      </w:tblPr>
-      <w:tblGrid>
-        <w:gridCol w:w="10080"/>
-      </w:tblGrid>
-      <w:tr>
-        <w:trPr>
-          <w:trHeight w:hRule="exact" w:val="1944"/>
-          <w:jc w:val="center"/>
-        </w:trPr>
-        <w:tc>
-          <w:tcPr>
-            <w:tcW w:w="10080" w:type="dxa"/>
-            <w:shd w:val="clear" w:color="auto" w:fill="F8FAFC"/>
-            <w:vAlign w:val="center"/>
-          </w:tcPr>
-          <w:p>
-            <w:pPr>
-              <w:jc w:val="center"/>
-            </w:pPr>
-            <w:r/>
-            <w:r>
-              <w:rPr>
-                <w:b/>
-                <w:sz w:val="22"/>
-              </w:rPr>
-              <w:t>Screenshot 7: Contact Form Validation</w:t>
-            </w:r>
-          </w:p>
-          <w:p>
-            <w:pPr>
-              <w:jc w:val="center"/>
-            </w:pPr>
-            <w:r>
-              <w:drawing>
-                <wp:inline xmlns:a="http://schemas.openxmlformats.org/drawingml/2006/main" xmlns:pic="http://schemas.openxmlformats.org/drawingml/2006/picture">
-                  <wp:extent cx="5577840" cy="4240030"/>
-                  <wp:docPr id="7" name="Picture 7"/>
-                  <wp:cNvGraphicFramePr>
-                    <a:graphicFrameLocks noChangeAspect="1"/>
-                  </wp:cNvGraphicFramePr>
-                  <a:graphic>
-                    <a:graphicData uri="http://schemas.openxmlformats.org/drawingml/2006/picture">
-                      <pic:pic>
-                        <pic:nvPicPr>
-                          <pic:cNvPr id="0" name="07_contact_validation.png"/>
-                          <pic:cNvPicPr/>
-                        </pic:nvPicPr>
-                        <pic:blipFill>
-                          <a:blip r:embed="rId17"/>
-                          <a:stretch>
-                            <a:fillRect/>
-                          </a:stretch>
-                        </pic:blipFill>
-                        <pic:spPr>
-                          <a:xfrm>
-                            <a:off x="0" y="0"/>
-                            <a:ext cx="5577840" cy="4240030"/>
-                          </a:xfrm>
-                          <a:prstGeom prst="rect"/>
-                        </pic:spPr>
-                      </pic:pic>
-                    </a:graphicData>
-                  </a:graphic>
-                </wp:inline>
-              </w:drawing>
-            </w:r>
-          </w:p>
-        </w:tc>
-      </w:tr>
-    </w:tbl>
-    <w:tbl>
-      <w:tblPr>
-        <w:tblW w:type="auto" w:w="0"/>
-        <w:jc w:val="center"/>
-        <w:tblLook w:firstColumn="1" w:firstRow="1" w:lastColumn="0" w:lastRow="0" w:noHBand="0" w:noVBand="1" w:val="04A0"/>
-      </w:tblPr>
-      <w:tblGrid>
-        <w:gridCol w:w="10080"/>
-      </w:tblGrid>
-      <w:tr>
-        <w:tc>
-          <w:tcPr>
-            <w:tcW w:type="dxa" w:w="10080"/>
-            <w:vAlign w:val="center"/>
-          </w:tcPr>
-          <w:p>
-            <w:pPr>
-              <w:jc w:val="center"/>
-            </w:pPr>
-            <w:r/>
-            <w:r>
-              <w:rPr>
-                <w:b/>
-                <w:sz w:val="22"/>
-              </w:rPr>
-              <w:t>Screenshot 8: Footer Details</w:t>
-            </w:r>
-          </w:p>
-          <w:p>
-            <w:pPr>
-              <w:jc w:val="center"/>
-            </w:pPr>
-            <w:r>
-              <w:drawing>
-                <wp:inline xmlns:a="http://schemas.openxmlformats.org/drawingml/2006/main" xmlns:pic="http://schemas.openxmlformats.org/drawingml/2006/picture">
-                  <wp:extent cx="5577840" cy="1533906"/>
-                  <wp:docPr id="8" name="Picture 8"/>
-                  <wp:cNvGraphicFramePr>
-                    <a:graphicFrameLocks noChangeAspect="1"/>
-                  </wp:cNvGraphicFramePr>
-                  <a:graphic>
-                    <a:graphicData uri="http://schemas.openxmlformats.org/drawingml/2006/picture">
-                      <pic:pic>
-                        <pic:nvPicPr>
-                          <pic:cNvPr id="0" name="08_footer_details.png"/>
-                          <pic:cNvPicPr/>
-                        </pic:nvPicPr>
-                        <pic:blipFill>
-                          <a:blip r:embed="rId18"/>
-                          <a:stretch>
-                            <a:fillRect/>
-                          </a:stretch>
-                        </pic:blipFill>
-                        <pic:spPr>
-                          <a:xfrm>
-                            <a:off x="0" y="0"/>
-                            <a:ext cx="5577840" cy="1533906"/>
-                          </a:xfrm>
-                          <a:prstGeom prst="rect"/>
-                        </pic:spPr>
-                      </pic:pic>
-                    </a:graphicData>
-                  </a:graphic>
-                </wp:inline>
-              </w:drawing>
-            </w:r>
-          </w:p>
-        </w:tc>
-      </w:tr>
-    </w:tbl>
     <w:p>
       <w:pPr>
         <w:spacing w:after="40"/>
@@ -2363,7 +2389,7 @@
       </w:r>
     </w:p>
     <w:sectPr>
-      <w:footerReference w:type="default" r:id="rId8"/>
+      <w:footerReference w:type="default" r:id="rId16"/>
       <w:pgSz w:w="12240" w:h="15840"/>
       <w:pgMar w:top="936" w:right="1080" w:bottom="936" w:left="1080" w:header="720" w:footer="720" w:gutter="0"/>
       <w:cols w:space="720"/>

</xml_diff>